<commit_message>
Lab 6 and Lab 7 updated
</commit_message>
<xml_diff>
--- a/Labs/Lab_6/Lab_6.docx
+++ b/Labs/Lab_6/Lab_6.docx
@@ -4,13 +4,13 @@
   <w:body>
     <w:p>
       <w:pPr>
+        <w:jc w:val="center"/>
         <w:rPr>
           <w:rFonts w:ascii="Times New Roman" w:hAnsi="Times New Roman" w:cs="Times New Roman"/>
           <w:b/>
           <w:bCs/>
           <w:sz w:val="26"/>
           <w:szCs w:val="26"/>
-          <w:lang w:val="en-US"/>
         </w:rPr>
       </w:pPr>
       <w:r>
@@ -22,7 +22,7 @@
           <w:szCs w:val="26"/>
           <w:lang w:val="ru-RU"/>
         </w:rPr>
-        <w:t>Задание 1</w:t>
+        <w:t xml:space="preserve">Лабораторная работа </w:t>
       </w:r>
       <w:r>
         <w:rPr>
@@ -31,7 +31,88 @@
           <w:bCs/>
           <w:sz w:val="26"/>
           <w:szCs w:val="26"/>
+        </w:rPr>
+        <w:t>№6</w:t>
+      </w:r>
+    </w:p>
+    <w:p>
+      <w:pPr>
+        <w:jc w:val="center"/>
+        <w:rPr>
+          <w:rFonts w:ascii="Times New Roman" w:hAnsi="Times New Roman" w:cs="Times New Roman"/>
+          <w:b/>
+          <w:bCs/>
+          <w:sz w:val="26"/>
+          <w:szCs w:val="26"/>
           <w:lang w:val="en-US"/>
+        </w:rPr>
+      </w:pPr>
+      <w:r>
+        <w:rPr>
+          <w:rFonts w:ascii="Times New Roman" w:hAnsi="Times New Roman" w:cs="Times New Roman"/>
+          <w:b/>
+          <w:bCs/>
+          <w:sz w:val="26"/>
+          <w:szCs w:val="26"/>
+          <w:lang w:val="en-US"/>
+        </w:rPr>
+        <w:t>Sarsen Dimash</w:t>
+      </w:r>
+    </w:p>
+    <w:p>
+      <w:pPr>
+        <w:jc w:val="center"/>
+        <w:rPr>
+          <w:rFonts w:ascii="Times New Roman" w:hAnsi="Times New Roman" w:cs="Times New Roman"/>
+          <w:b/>
+          <w:bCs/>
+          <w:sz w:val="26"/>
+          <w:szCs w:val="26"/>
+          <w:lang w:val="en-US"/>
+        </w:rPr>
+      </w:pPr>
+      <w:r>
+        <w:rPr>
+          <w:rFonts w:ascii="Times New Roman" w:hAnsi="Times New Roman" w:cs="Times New Roman"/>
+          <w:b/>
+          <w:bCs/>
+          <w:sz w:val="26"/>
+          <w:szCs w:val="26"/>
+          <w:lang w:val="en-US"/>
+        </w:rPr>
+        <w:t>SIS-2412CS</w:t>
+      </w:r>
+    </w:p>
+    <w:p>
+      <w:pPr>
+        <w:rPr>
+          <w:rFonts w:ascii="Times New Roman" w:hAnsi="Times New Roman" w:cs="Times New Roman"/>
+          <w:b/>
+          <w:bCs/>
+          <w:sz w:val="26"/>
+          <w:szCs w:val="26"/>
+          <w:lang w:val="ru-RU"/>
+        </w:rPr>
+      </w:pPr>
+      <w:r>
+        <w:rPr>
+          <w:rFonts w:ascii="Times New Roman" w:hAnsi="Times New Roman" w:cs="Times New Roman"/>
+          <w:b/>
+          <w:bCs/>
+          <w:sz w:val="26"/>
+          <w:szCs w:val="26"/>
+          <w:lang w:val="ru-RU"/>
+        </w:rPr>
+        <w:t>Задание 1</w:t>
+      </w:r>
+      <w:r>
+        <w:rPr>
+          <w:rFonts w:ascii="Times New Roman" w:hAnsi="Times New Roman" w:cs="Times New Roman"/>
+          <w:b/>
+          <w:bCs/>
+          <w:sz w:val="26"/>
+          <w:szCs w:val="26"/>
+          <w:lang w:val="ru-RU"/>
         </w:rPr>
         <w:t xml:space="preserve">. </w:t>
       </w:r>
@@ -43,8 +124,20 @@
           <w:sz w:val="26"/>
           <w:szCs w:val="26"/>
         </w:rPr>
-        <w:t>Четырёхразрядный сумматор-вычитатель</w:t>
-      </w:r>
+        <w:t>Четырёхразрядный сумматор-</w:t>
+      </w:r>
+      <w:proofErr w:type="spellStart"/>
+      <w:r>
+        <w:rPr>
+          <w:rFonts w:ascii="Times New Roman" w:eastAsia="Arial" w:hAnsi="Times New Roman" w:cs="Times New Roman"/>
+          <w:b/>
+          <w:bCs/>
+          <w:sz w:val="26"/>
+          <w:szCs w:val="26"/>
+        </w:rPr>
+        <w:t>вычитатель</w:t>
+      </w:r>
+      <w:proofErr w:type="spellEnd"/>
     </w:p>
     <w:p>
       <w:pPr>
@@ -172,6 +265,7 @@
                 <w:sz w:val="26"/>
                 <w:szCs w:val="26"/>
               </w:rPr>
+              <w:lastRenderedPageBreak/>
               <w:t>A</w:t>
             </w:r>
           </w:p>
@@ -1670,7 +1764,6 @@
           <w:szCs w:val="26"/>
           <w:lang w:val="ru-RU"/>
         </w:rPr>
-        <w:lastRenderedPageBreak/>
         <w:t>Задание 2</w:t>
       </w:r>
       <w:r>
@@ -3184,6 +3277,7 @@
           <w:szCs w:val="26"/>
           <w:lang w:val="en-US"/>
         </w:rPr>
+        <w:lastRenderedPageBreak/>
         <w:drawing>
           <wp:inline distT="0" distB="0" distL="0" distR="0" wp14:anchorId="7938D89E" wp14:editId="40687F0A">
             <wp:extent cx="5689600" cy="2623115"/>
@@ -3260,7 +3354,6 @@
                 <w:b/>
                 <w:sz w:val="19"/>
               </w:rPr>
-              <w:lastRenderedPageBreak/>
               <w:t>A</w:t>
             </w:r>
           </w:p>
@@ -4264,6 +4357,7 @@
                 <w:b/>
                 <w:sz w:val="19"/>
               </w:rPr>
+              <w:lastRenderedPageBreak/>
               <w:t>F2 F1 F0</w:t>
             </w:r>
           </w:p>
@@ -5240,7 +5334,6 @@
                 <w:b/>
                 <w:sz w:val="19"/>
               </w:rPr>
-              <w:lastRenderedPageBreak/>
               <w:t>№</w:t>
             </w:r>
           </w:p>
@@ -6882,6 +6975,7 @@
       <w:r>
         <w:rPr>
           <w:rFonts w:ascii="Times New Roman" w:hAnsi="Times New Roman" w:cs="Times New Roman"/>
+          <w:noProof/>
           <w:sz w:val="26"/>
           <w:szCs w:val="26"/>
           <w:lang w:val="ru-RU"/>
@@ -6942,6 +7036,7 @@
           <w:sz w:val="26"/>
           <w:szCs w:val="26"/>
         </w:rPr>
+        <w:lastRenderedPageBreak/>
         <w:t xml:space="preserve">Переполнение арифметики возникает в строках </w:t>
       </w:r>
       <w:r>
@@ -7226,11 +7321,11 @@
       <w:r>
         <w:rPr>
           <w:rFonts w:ascii="Times New Roman" w:hAnsi="Times New Roman" w:cs="Times New Roman"/>
+          <w:noProof/>
           <w:sz w:val="26"/>
           <w:szCs w:val="26"/>
           <w:lang w:val="en-US"/>
         </w:rPr>
-        <w:lastRenderedPageBreak/>
         <w:drawing>
           <wp:inline distT="0" distB="0" distL="0" distR="0" wp14:anchorId="5E28E525" wp14:editId="7C8AB99F">
             <wp:extent cx="5940425" cy="4847590"/>
@@ -7288,6 +7383,23 @@
     <w:p>
       <w:pPr>
         <w:rPr>
+          <w:rFonts w:ascii="Times New Roman" w:hAnsi="Times New Roman" w:cs="Times New Roman"/>
+          <w:sz w:val="26"/>
+          <w:szCs w:val="26"/>
+        </w:rPr>
+      </w:pPr>
+      <w:r>
+        <w:rPr>
+          <w:rFonts w:ascii="Times New Roman" w:hAnsi="Times New Roman" w:cs="Times New Roman"/>
+          <w:sz w:val="26"/>
+          <w:szCs w:val="26"/>
+        </w:rPr>
+        <w:t>Старший бит A3 при сдвиге отбрасывается, а младший разряд заполняется нулём. Поэтому 1001 превращается в 0010</w:t>
+      </w:r>
+    </w:p>
+    <w:p>
+      <w:pPr>
+        <w:rPr>
           <w:rFonts w:ascii="Arial" w:eastAsia="Arial" w:hAnsi="Arial" w:cs="Arial"/>
           <w:sz w:val="22"/>
           <w:lang w:val="ru-RU"/>
@@ -7448,6 +7560,7 @@
                 <w:b/>
                 <w:sz w:val="19"/>
               </w:rPr>
+              <w:lastRenderedPageBreak/>
               <w:t>F</w:t>
             </w:r>
           </w:p>
@@ -7514,14 +7627,7 @@
                 <w:rFonts w:ascii="Arial" w:eastAsia="Arial" w:hAnsi="Arial" w:cs="Arial"/>
                 <w:sz w:val="19"/>
               </w:rPr>
-              <w:t>1</w:t>
-            </w:r>
-            <w:r>
-              <w:rPr>
-                <w:rFonts w:ascii="Arial" w:eastAsia="Arial" w:hAnsi="Arial" w:cs="Arial"/>
-                <w:sz w:val="19"/>
-              </w:rPr>
-              <w:t>10</w:t>
+              <w:t>110</w:t>
             </w:r>
           </w:p>
         </w:tc>
@@ -7806,7 +7912,6 @@
           <w:sz w:val="26"/>
           <w:szCs w:val="26"/>
         </w:rPr>
-        <w:lastRenderedPageBreak/>
         <w:t>Старая формула при F = 111 давала Sub = 0. Для сравнения необходимо Sub = 1, поэтому управление изменено с добавлением OR:</w:t>
       </w:r>
     </w:p>
@@ -7964,6 +8069,7 @@
       <w:r>
         <w:rPr>
           <w:rFonts w:ascii="Times New Roman" w:hAnsi="Times New Roman" w:cs="Times New Roman"/>
+          <w:noProof/>
           <w:sz w:val="26"/>
           <w:szCs w:val="26"/>
           <w:lang w:val="ru-RU"/>
@@ -8083,6 +8189,7 @@
                 <w:b/>
                 <w:sz w:val="18"/>
               </w:rPr>
+              <w:lastRenderedPageBreak/>
               <w:t>F2</w:t>
             </w:r>
           </w:p>
@@ -9229,7 +9336,6 @@
           <w:sz w:val="26"/>
           <w:szCs w:val="26"/>
         </w:rPr>
-        <w:lastRenderedPageBreak/>
         <w:t>Карта Карно. Столбцы F1F0 расположены в порядке Грея</w:t>
       </w:r>
       <w:r>
@@ -10700,7 +10806,7 @@
           <w:bCs/>
           <w:sz w:val="26"/>
           <w:szCs w:val="26"/>
-          <w:lang w:val="en-US"/>
+          <w:lang w:val="ru-RU"/>
         </w:rPr>
       </w:pPr>
       <w:r>
@@ -10721,7 +10827,7 @@
           <w:bCs/>
           <w:sz w:val="26"/>
           <w:szCs w:val="26"/>
-          <w:lang w:val="en-US"/>
+          <w:lang w:val="ru-RU"/>
         </w:rPr>
         <w:t>:</w:t>
       </w:r>
@@ -10749,6 +10855,7 @@
           <w:lang w:eastAsia="ru-KZ"/>
           <w14:ligatures w14:val="none"/>
         </w:rPr>
+        <w:lastRenderedPageBreak/>
         <w:t>1. Зачем нужны XOR на входах B и сигнал Sub на C0?</w:t>
       </w:r>
     </w:p>
@@ -11004,7 +11111,6 @@
           <w:lang w:eastAsia="ru-KZ"/>
           <w14:ligatures w14:val="none"/>
         </w:rPr>
-        <w:lastRenderedPageBreak/>
         <w:t xml:space="preserve">Например, при </w:t>
       </w:r>
       <w:r>
@@ -11837,7 +11943,19 @@
           <w:lang w:eastAsia="ru-KZ"/>
           <w14:ligatures w14:val="none"/>
         </w:rPr>
-        <w:t xml:space="preserve"> устанавливается Sub = 0, а мультиплексор выбирает вход 0. При коде </w:t>
+        <w:t xml:space="preserve"> устанавливается Sub = 0, а мультиплексор выбирает вход 0. При </w:t>
+      </w:r>
+      <w:r>
+        <w:rPr>
+          <w:rFonts w:ascii="Times New Roman" w:eastAsia="Times New Roman" w:hAnsi="Times New Roman" w:cs="Times New Roman"/>
+          <w:kern w:val="0"/>
+          <w:sz w:val="26"/>
+          <w:szCs w:val="26"/>
+          <w:lang w:eastAsia="ru-KZ"/>
+          <w14:ligatures w14:val="none"/>
+        </w:rPr>
+        <w:lastRenderedPageBreak/>
+        <w:t xml:space="preserve">коде </w:t>
       </w:r>
       <w:r>
         <w:rPr>
@@ -12061,7 +12179,6 @@
           <w:lang w:eastAsia="ru-KZ"/>
           <w14:ligatures w14:val="none"/>
         </w:rPr>
-        <w:lastRenderedPageBreak/>
         <w:t xml:space="preserve">Эти команды по-разному трактуют старший бит. </w:t>
       </w:r>
       <w:r>

</xml_diff>